<commit_message>
docs(acrme): add requirements baseline v3.0 and hard constraints reference v1.1
</commit_message>
<xml_diff>
--- a/Reference-Material/reference/acrme_hard_constraints_reference.docx
+++ b/Reference-Material/reference/acrme_hard_constraints_reference.docx
@@ -2,7 +2,7 @@
 <file path=word/document.xml><?xml version="1.0" encoding="utf-8"?>
 <w:document xmlns:w="http://schemas.openxmlformats.org/wordprocessingml/2006/main" xmlns:m="http://schemas.openxmlformats.org/officeDocument/2006/math" xmlns:r="http://schemas.openxmlformats.org/officeDocument/2006/relationships" xmlns:o="urn:schemas-microsoft-com:office:office" xmlns:v="urn:schemas-microsoft-com:vml" xmlns:w10="urn:schemas-microsoft-com:office:word" xmlns:a="http://schemas.openxmlformats.org/drawingml/2006/main" xmlns:pic="http://schemas.openxmlformats.org/drawingml/2006/picture" xmlns:wp="http://schemas.openxmlformats.org/drawingml/2006/wordprocessingDrawing">
   <w:body>
-    <w:bookmarkStart w:id="120" w:name="acrme-hard-constraints-reference"/>
+    <w:bookmarkStart w:id="121" w:name="acrme-hard-constraints-reference"/>
     <w:p>
       <w:pPr>
         <w:pStyle w:val="Heading1"/>
@@ -42,7 +42,7 @@
         <w:t xml:space="preserve"> </w:t>
       </w:r>
       <w:r>
-        <w:t xml:space="preserve">1.0</w:t>
+        <w:t xml:space="preserve">1.1</w:t>
       </w:r>
       <w:r>
         <w:br/>
@@ -58,7 +58,7 @@
         <w:t xml:space="preserve"> </w:t>
       </w:r>
       <w:r>
-        <w:t xml:space="preserve">August 2026</w:t>
+        <w:t xml:space="preserve">8 Oct 2026</w:t>
       </w:r>
       <w:r>
         <w:br/>
@@ -75,6 +75,364 @@
       </w:r>
       <w:r>
         <w:t xml:space="preserve">Production Ready</w:t>
+      </w:r>
+    </w:p>
+    <w:p>
+      <w:pPr>
+        <w:pStyle w:val="BlockText"/>
+      </w:pPr>
+      <w:r>
+        <w:rPr>
+          <w:bCs/>
+          <w:b/>
+        </w:rPr>
+        <w:t xml:space="preserve">v3.0 reconciliation note (8 Oct 2026).</w:t>
+      </w:r>
+      <w:r>
+        <w:t xml:space="preserve"> </w:t>
+      </w:r>
+      <w:r>
+        <w:t xml:space="preserve">Requirements Baseline</w:t>
+      </w:r>
+      <w:r>
+        <w:t xml:space="preserve"> </w:t>
+      </w:r>
+      <w:r>
+        <w:rPr>
+          <w:bCs/>
+          <w:b/>
+        </w:rPr>
+        <w:t xml:space="preserve">v3.0</w:t>
+      </w:r>
+      <w:r>
+        <w:t xml:space="preserve"> </w:t>
+      </w:r>
+      <w:r>
+        <w:t xml:space="preserve">folds in the multi-domain customer model while leaving</w:t>
+      </w:r>
+      <w:r>
+        <w:t xml:space="preserve"> </w:t>
+      </w:r>
+      <w:r>
+        <w:rPr>
+          <w:bCs/>
+          <w:b/>
+        </w:rPr>
+        <w:t xml:space="preserve">all hard constraints (HC-1..HC-11) unchanged</w:t>
+      </w:r>
+      <w:r>
+        <w:t xml:space="preserve"> </w:t>
+      </w:r>
+      <w:r>
+        <w:t xml:space="preserve">(Baseline §11.1). v3.0 restructures</w:t>
+      </w:r>
+      <w:r>
+        <w:t xml:space="preserve"> </w:t>
+      </w:r>
+      <w:r>
+        <w:rPr>
+          <w:iCs/>
+          <w:i/>
+        </w:rPr>
+        <w:t xml:space="preserve">where existing gates apply</w:t>
+      </w:r>
+      <w:r>
+        <w:t xml:space="preserve"> </w:t>
+      </w:r>
+      <w:r>
+        <w:t xml:space="preserve">into</w:t>
+      </w:r>
+      <w:r>
+        <w:t xml:space="preserve"> </w:t>
+      </w:r>
+      <w:r>
+        <w:rPr>
+          <w:bCs/>
+          <w:b/>
+        </w:rPr>
+        <w:t xml:space="preserve">two evaluation scopes</w:t>
+      </w:r>
+      <w:r>
+        <w:t xml:space="preserve"> </w:t>
+      </w:r>
+      <w:r>
+        <w:t xml:space="preserve">rather than introducing any new gate: region selection is</w:t>
+      </w:r>
+      <w:r>
+        <w:t xml:space="preserve"> </w:t>
+      </w:r>
+      <w:r>
+        <w:rPr>
+          <w:bCs/>
+          <w:b/>
+        </w:rPr>
+        <w:t xml:space="preserve">customer-scoped</w:t>
+      </w:r>
+      <w:r>
+        <w:t xml:space="preserve"> </w:t>
+      </w:r>
+      <w:r>
+        <w:t xml:space="preserve">— the Customer Region Vector</w:t>
+      </w:r>
+      <w:r>
+        <w:t xml:space="preserve"> </w:t>
+      </w:r>
+      <w:r>
+        <w:rPr>
+          <w:rStyle w:val="VerbatimChar"/>
+        </w:rPr>
+        <w:t xml:space="preserve">CRV(C,G) = (geography, distribution model, prod, cval, dr)</w:t>
+      </w:r>
+      <w:r>
+        <w:t xml:space="preserve"> </w:t>
+      </w:r>
+      <w:r>
+        <w:t xml:space="preserve">(PLC-013) resolves</w:t>
+      </w:r>
+      <w:r>
+        <w:t xml:space="preserve"> </w:t>
+      </w:r>
+      <w:r>
+        <w:rPr>
+          <w:bCs/>
+          <w:b/>
+        </w:rPr>
+        <w:t xml:space="preserve">once per customer × geography</w:t>
+      </w:r>
+      <w:r>
+        <w:t xml:space="preserve"> </w:t>
+      </w:r>
+      <w:r>
+        <w:t xml:space="preserve">and is cached and reused by every domain group; instance groups and capacity are</w:t>
+      </w:r>
+      <w:r>
+        <w:t xml:space="preserve"> </w:t>
+      </w:r>
+      <w:r>
+        <w:rPr>
+          <w:bCs/>
+          <w:b/>
+        </w:rPr>
+        <w:t xml:space="preserve">domain-group-scoped</w:t>
+      </w:r>
+      <w:r>
+        <w:t xml:space="preserve"> </w:t>
+      </w:r>
+      <w:r>
+        <w:t xml:space="preserve">— the Domain Placement Binding</w:t>
+      </w:r>
+      <w:r>
+        <w:t xml:space="preserve"> </w:t>
+      </w:r>
+      <w:r>
+        <w:rPr>
+          <w:rStyle w:val="VerbatimChar"/>
+        </w:rPr>
+        <w:t xml:space="preserve">DPB(D,E)</w:t>
+      </w:r>
+      <w:r>
+        <w:t xml:space="preserve"> </w:t>
+      </w:r>
+      <w:r>
+        <w:t xml:space="preserve">(PLC-014) is resolved</w:t>
+      </w:r>
+      <w:r>
+        <w:t xml:space="preserve"> </w:t>
+      </w:r>
+      <w:r>
+        <w:rPr>
+          <w:bCs/>
+          <w:b/>
+        </w:rPr>
+        <w:t xml:space="preserve">per domain × environment × region</w:t>
+      </w:r>
+      <w:r>
+        <w:t xml:space="preserve"> </w:t>
+      </w:r>
+      <w:r>
+        <w:t xml:space="preserve">on that domain’s ig subscription. Region-level gates (HC-1, HC-4, HC-5, HC-8, HC-9, HC-10) are evaluated when the CRV is resolved (customer scope); capacity/quota/floor gates (HC-2, HC-3, HC-6, HC-7) are evaluated per domain ig when the DPB is resolved (domain scope), with quota drawn from the customer’s</w:t>
+      </w:r>
+      <w:r>
+        <w:t xml:space="preserve"> </w:t>
+      </w:r>
+      <w:r>
+        <w:rPr>
+          <w:bCs/>
+          <w:b/>
+        </w:rPr>
+        <w:t xml:space="preserve">central quota group</w:t>
+      </w:r>
+      <w:r>
+        <w:t xml:space="preserve"> </w:t>
+      </w:r>
+      <w:r>
+        <w:t xml:space="preserve">spanning all domain subscriptions (QUA-015, per region × VM-family cell, 85% replenishment thresholds). Enforcement ordering is governed by</w:t>
+      </w:r>
+      <w:r>
+        <w:t xml:space="preserve"> </w:t>
+      </w:r>
+      <w:r>
+        <w:rPr>
+          <w:bCs/>
+          <w:b/>
+        </w:rPr>
+        <w:t xml:space="preserve">PLC-015</w:t>
+      </w:r>
+      <w:r>
+        <w:t xml:space="preserve"> </w:t>
+      </w:r>
+      <w:r>
+        <w:t xml:space="preserve">(CRV strictly precedes DPB; a domain never re-runs region selection). v3.0 boundary rules are</w:t>
+      </w:r>
+      <w:r>
+        <w:t xml:space="preserve"> </w:t>
+      </w:r>
+      <w:r>
+        <w:rPr>
+          <w:bCs/>
+          <w:b/>
+        </w:rPr>
+        <w:t xml:space="preserve">scoping rules, not new hard constraints</w:t>
+      </w:r>
+      <w:r>
+        <w:t xml:space="preserve"> </w:t>
+      </w:r>
+      <w:r>
+        <w:t xml:space="preserve">(per user standing constraint</w:t>
+      </w:r>
+      <w:r>
+        <w:t xml:space="preserve"> </w:t>
+      </w:r>
+      <w:r>
+        <w:t xml:space="preserve">“</w:t>
+      </w:r>
+      <w:r>
+        <w:t xml:space="preserve">keep all existing hard constraints intact</w:t>
+      </w:r>
+      <w:r>
+        <w:t xml:space="preserve">”</w:t>
+      </w:r>
+      <w:r>
+        <w:t xml:space="preserve">):</w:t>
+      </w:r>
+      <w:r>
+        <w:t xml:space="preserve"> </w:t>
+      </w:r>
+      <w:r>
+        <w:rPr>
+          <w:bCs/>
+          <w:b/>
+        </w:rPr>
+        <w:t xml:space="preserve">DOM-004</w:t>
+      </w:r>
+      <w:r>
+        <w:t xml:space="preserve"> </w:t>
+      </w:r>
+      <w:r>
+        <w:t xml:space="preserve">domain-bounded sharing (a CVAL/DR shared CRG never crosses domain boundaries),</w:t>
+      </w:r>
+      <w:r>
+        <w:t xml:space="preserve"> </w:t>
+      </w:r>
+      <w:r>
+        <w:rPr>
+          <w:bCs/>
+          <w:b/>
+        </w:rPr>
+        <w:t xml:space="preserve">CAP-025</w:t>
+      </w:r>
+      <w:r>
+        <w:t xml:space="preserve"> </w:t>
+      </w:r>
+      <w:r>
+        <w:t xml:space="preserve">CRG-set separation (prod / cvdr / drf set types per Domain × Environment × Region, never mixed),</w:t>
+      </w:r>
+      <w:r>
+        <w:t xml:space="preserve"> </w:t>
+      </w:r>
+      <w:r>
+        <w:rPr>
+          <w:bCs/>
+          <w:b/>
+        </w:rPr>
+        <w:t xml:space="preserve">PLC-015</w:t>
+      </w:r>
+      <w:r>
+        <w:t xml:space="preserve"> </w:t>
+      </w:r>
+      <w:r>
+        <w:t xml:space="preserve">two-phase resolution gate. The</w:t>
+      </w:r>
+      <w:r>
+        <w:t xml:space="preserve"> </w:t>
+      </w:r>
+      <w:r>
+        <w:rPr>
+          <w:bCs/>
+          <w:b/>
+        </w:rPr>
+        <w:t xml:space="preserve">DR Foundation</w:t>
+      </w:r>
+      <w:r>
+        <w:t xml:space="preserve"> </w:t>
+      </w:r>
+      <w:r>
+        <w:t xml:space="preserve">(DR-021, dedicated always-present bootstrap CRG set per domain) is covered by the same HC-6/HC-7 floor accounting without double-counting the CVAL/DR shared set. New v3.0 scoping validation rules</w:t>
+      </w:r>
+      <w:r>
+        <w:t xml:space="preserve"> </w:t>
+      </w:r>
+      <w:r>
+        <w:rPr>
+          <w:bCs/>
+          <w:b/>
+        </w:rPr>
+        <w:t xml:space="preserve">VR-12..VR-14</w:t>
+      </w:r>
+      <w:r>
+        <w:t xml:space="preserve">, POCs</w:t>
+      </w:r>
+      <w:r>
+        <w:t xml:space="preserve"> </w:t>
+      </w:r>
+      <w:r>
+        <w:rPr>
+          <w:bCs/>
+          <w:b/>
+        </w:rPr>
+        <w:t xml:space="preserve">POC-012/013</w:t>
+      </w:r>
+      <w:r>
+        <w:t xml:space="preserve">, configurable items</w:t>
+      </w:r>
+      <w:r>
+        <w:t xml:space="preserve"> </w:t>
+      </w:r>
+      <w:r>
+        <w:rPr>
+          <w:bCs/>
+          <w:b/>
+        </w:rPr>
+        <w:t xml:space="preserve">C-14..C-16</w:t>
+      </w:r>
+      <w:r>
+        <w:t xml:space="preserve">, and decision</w:t>
+      </w:r>
+      <w:r>
+        <w:t xml:space="preserve"> </w:t>
+      </w:r>
+      <w:r>
+        <w:rPr>
+          <w:bCs/>
+          <w:b/>
+        </w:rPr>
+        <w:t xml:space="preserve">DEC-004</w:t>
+      </w:r>
+      <w:r>
+        <w:t xml:space="preserve"> </w:t>
+      </w:r>
+      <w:r>
+        <w:t xml:space="preserve">are carried below; see Baseline §11.1, §11A, CAP-025, QUA-015, DR-021.</w:t>
       </w:r>
     </w:p>
     <w:p>
@@ -10828,7 +11186,7 @@
       </w:r>
     </w:p>
     <w:bookmarkEnd w:id="103"/>
-    <w:bookmarkStart w:id="107" w:name="part-3-enforcement-pipeline"/>
+    <w:bookmarkStart w:id="108" w:name="part-3-enforcement-pipeline"/>
     <w:p>
       <w:pPr>
         <w:pStyle w:val="Heading2"/>
@@ -12044,8 +12402,409 @@
       </w:r>
     </w:p>
     <w:bookmarkEnd w:id="106"/>
+    <w:bookmarkStart w:id="107" w:name="stage-4-two-scope-evaluation-v3.0"/>
+    <w:p>
+      <w:pPr>
+        <w:pStyle w:val="Heading3"/>
+      </w:pPr>
+      <w:r>
+        <w:t xml:space="preserve">Stage 4 — Two-Scope Evaluation (v3.0)</w:t>
+      </w:r>
+    </w:p>
+    <w:p>
+      <w:pPr>
+        <w:pStyle w:val="FirstParagraph"/>
+      </w:pPr>
+      <w:r>
+        <w:t xml:space="preserve">Requirements Baseline</w:t>
+      </w:r>
+      <w:r>
+        <w:t xml:space="preserve"> </w:t>
+      </w:r>
+      <w:r>
+        <w:rPr>
+          <w:bCs/>
+          <w:b/>
+        </w:rPr>
+        <w:t xml:space="preserve">v3.0</w:t>
+      </w:r>
+      <w:r>
+        <w:t xml:space="preserve"> </w:t>
+      </w:r>
+      <w:r>
+        <w:t xml:space="preserve">splits hard-constraint evaluation across</w:t>
+      </w:r>
+      <w:r>
+        <w:t xml:space="preserve"> </w:t>
+      </w:r>
+      <w:r>
+        <w:rPr>
+          <w:bCs/>
+          <w:b/>
+        </w:rPr>
+        <w:t xml:space="preserve">two scopes</w:t>
+      </w:r>
+      <w:r>
+        <w:t xml:space="preserve"> </w:t>
+      </w:r>
+      <w:r>
+        <w:t xml:space="preserve">without changing any HC definition (Baseline §11.1; standing constraint: HC-1..HC-11 intact):</w:t>
+      </w:r>
+    </w:p>
+    <w:p>
+      <w:pPr>
+        <w:pStyle w:val="BodyText"/>
+      </w:pPr>
+      <w:r>
+        <w:rPr>
+          <w:bCs/>
+          <w:b/>
+        </w:rPr>
+        <w:t xml:space="preserve">Customer scope — CRV resolution (PLC-013).</w:t>
+      </w:r>
+      <w:r>
+        <w:t xml:space="preserve"> </w:t>
+      </w:r>
+      <w:r>
+        <w:t xml:space="preserve">Region-level gates are evaluated</w:t>
+      </w:r>
+      <w:r>
+        <w:t xml:space="preserve"> </w:t>
+      </w:r>
+      <w:r>
+        <w:rPr>
+          <w:bCs/>
+          <w:b/>
+        </w:rPr>
+        <w:t xml:space="preserve">once per customer × geography</w:t>
+      </w:r>
+      <w:r>
+        <w:t xml:space="preserve">, when the Customer Region Vector is resolved (or re-validated on migration, PLC-005):</w:t>
+      </w:r>
+      <w:r>
+        <w:t xml:space="preserve"> </w:t>
+      </w:r>
+      <w:r>
+        <w:t xml:space="preserve">- Stage 1 pre-filtering:</w:t>
+      </w:r>
+      <w:r>
+        <w:t xml:space="preserve"> </w:t>
+      </w:r>
+      <w:r>
+        <w:rPr>
+          <w:bCs/>
+          <w:b/>
+        </w:rPr>
+        <w:t xml:space="preserve">HC-8</w:t>
+      </w:r>
+      <w:r>
+        <w:t xml:space="preserve"> </w:t>
+      </w:r>
+      <w:r>
+        <w:t xml:space="preserve">(geography containment),</w:t>
+      </w:r>
+      <w:r>
+        <w:t xml:space="preserve"> </w:t>
+      </w:r>
+      <w:r>
+        <w:rPr>
+          <w:bCs/>
+          <w:b/>
+        </w:rPr>
+        <w:t xml:space="preserve">HC-9</w:t>
+      </w:r>
+      <w:r>
+        <w:t xml:space="preserve"> </w:t>
+      </w:r>
+      <w:r>
+        <w:t xml:space="preserve">(Standard regions only)</w:t>
+      </w:r>
+      <w:r>
+        <w:t xml:space="preserve"> </w:t>
+      </w:r>
+      <w:r>
+        <w:t xml:space="preserve">- Region gates:</w:t>
+      </w:r>
+      <w:r>
+        <w:t xml:space="preserve"> </w:t>
+      </w:r>
+      <w:r>
+        <w:rPr>
+          <w:bCs/>
+          <w:b/>
+        </w:rPr>
+        <w:t xml:space="preserve">HC-1</w:t>
+      </w:r>
+      <w:r>
+        <w:t xml:space="preserve"> </w:t>
+      </w:r>
+      <w:r>
+        <w:t xml:space="preserve">(region separation),</w:t>
+      </w:r>
+      <w:r>
+        <w:t xml:space="preserve"> </w:t>
+      </w:r>
+      <w:r>
+        <w:rPr>
+          <w:bCs/>
+          <w:b/>
+        </w:rPr>
+        <w:t xml:space="preserve">HC-4</w:t>
+      </w:r>
+      <w:r>
+        <w:t xml:space="preserve"> </w:t>
+      </w:r>
+      <w:r>
+        <w:t xml:space="preserve">(DR separation class),</w:t>
+      </w:r>
+      <w:r>
+        <w:t xml:space="preserve"> </w:t>
+      </w:r>
+      <w:r>
+        <w:rPr>
+          <w:bCs/>
+          <w:b/>
+        </w:rPr>
+        <w:t xml:space="preserve">HC-5</w:t>
+      </w:r>
+      <w:r>
+        <w:t xml:space="preserve"> </w:t>
+      </w:r>
+      <w:r>
+        <w:t xml:space="preserve">(zone availability),</w:t>
+      </w:r>
+      <w:r>
+        <w:t xml:space="preserve"> </w:t>
+      </w:r>
+      <w:r>
+        <w:rPr>
+          <w:bCs/>
+          <w:b/>
+        </w:rPr>
+        <w:t xml:space="preserve">HC-10</w:t>
+      </w:r>
+      <w:r>
+        <w:t xml:space="preserve"> </w:t>
+      </w:r>
+      <w:r>
+        <w:t xml:space="preserve">(cross-geo extension path)</w:t>
+      </w:r>
+    </w:p>
+    <w:p>
+      <w:pPr>
+        <w:pStyle w:val="BodyText"/>
+      </w:pPr>
+      <w:r>
+        <w:t xml:space="preserve">The resolved CRV</w:t>
+      </w:r>
+      <w:r>
+        <w:t xml:space="preserve"> </w:t>
+      </w:r>
+      <w:r>
+        <w:rPr>
+          <w:rStyle w:val="VerbatimChar"/>
+        </w:rPr>
+        <w:t xml:space="preserve">(geography, distribution model, prod, cval, dr)</w:t>
+      </w:r>
+      <w:r>
+        <w:t xml:space="preserve"> </w:t>
+      </w:r>
+      <w:r>
+        <w:t xml:space="preserve">is cached on the seed record and reused by</w:t>
+      </w:r>
+      <w:r>
+        <w:t xml:space="preserve"> </w:t>
+      </w:r>
+      <w:r>
+        <w:rPr>
+          <w:bCs/>
+          <w:b/>
+        </w:rPr>
+        <w:t xml:space="preserve">all</w:t>
+      </w:r>
+      <w:r>
+        <w:t xml:space="preserve"> </w:t>
+      </w:r>
+      <w:r>
+        <w:t xml:space="preserve">of the customer’s domain groups; a domain never re-runs region selection (PLC-015, VR-14).</w:t>
+      </w:r>
+    </w:p>
+    <w:p>
+      <w:pPr>
+        <w:pStyle w:val="BodyText"/>
+      </w:pPr>
+      <w:r>
+        <w:rPr>
+          <w:bCs/>
+          <w:b/>
+        </w:rPr>
+        <w:t xml:space="preserve">Domain scope — DPB resolution (PLC-014).</w:t>
+      </w:r>
+      <w:r>
+        <w:t xml:space="preserve"> </w:t>
+      </w:r>
+      <w:r>
+        <w:t xml:space="preserve">Capacity and quota gates are evaluated</w:t>
+      </w:r>
+      <w:r>
+        <w:t xml:space="preserve"> </w:t>
+      </w:r>
+      <w:r>
+        <w:rPr>
+          <w:bCs/>
+          <w:b/>
+        </w:rPr>
+        <w:t xml:space="preserve">per domain × environment × region</w:t>
+      </w:r>
+      <w:r>
+        <w:t xml:space="preserve">, each time a domain’s Domain Placement Binding is resolved on its ig subscription:</w:t>
+      </w:r>
+      <w:r>
+        <w:t xml:space="preserve"> </w:t>
+      </w:r>
+      <w:r>
+        <w:t xml:space="preserve">- Capacity gates:</w:t>
+      </w:r>
+      <w:r>
+        <w:t xml:space="preserve"> </w:t>
+      </w:r>
+      <w:r>
+        <w:rPr>
+          <w:bCs/>
+          <w:b/>
+        </w:rPr>
+        <w:t xml:space="preserve">HC-2</w:t>
+      </w:r>
+      <w:r>
+        <w:t xml:space="preserve"> </w:t>
+      </w:r>
+      <w:r>
+        <w:t xml:space="preserve">(capacity floor) against the domain’s CRG set per CAP-025 (Prod-dedicated / CVAL-DR shared / DR Foundation set types)</w:t>
+      </w:r>
+      <w:r>
+        <w:t xml:space="preserve"> </w:t>
+      </w:r>
+      <w:r>
+        <w:t xml:space="preserve">- Quota gates:</w:t>
+      </w:r>
+      <w:r>
+        <w:t xml:space="preserve"> </w:t>
+      </w:r>
+      <w:r>
+        <w:rPr>
+          <w:bCs/>
+          <w:b/>
+        </w:rPr>
+        <w:t xml:space="preserve">HC-3</w:t>
+      </w:r>
+      <w:r>
+        <w:t xml:space="preserve">,</w:t>
+      </w:r>
+      <w:r>
+        <w:t xml:space="preserve"> </w:t>
+      </w:r>
+      <w:r>
+        <w:rPr>
+          <w:bCs/>
+          <w:b/>
+        </w:rPr>
+        <w:t xml:space="preserve">HC-7</w:t>
+      </w:r>
+      <w:r>
+        <w:t xml:space="preserve"> </w:t>
+      </w:r>
+      <w:r>
+        <w:t xml:space="preserve">against the customer’s</w:t>
+      </w:r>
+      <w:r>
+        <w:t xml:space="preserve"> </w:t>
+      </w:r>
+      <w:r>
+        <w:rPr>
+          <w:bCs/>
+          <w:b/>
+        </w:rPr>
+        <w:t xml:space="preserve">central quota group</w:t>
+      </w:r>
+      <w:r>
+        <w:t xml:space="preserve"> </w:t>
+      </w:r>
+      <w:r>
+        <w:t xml:space="preserve">(QUA-015) per region × VM-family cell, spanning all domain ig subscriptions (DOM-002); 85% replenishment thresholds</w:t>
+      </w:r>
+      <w:r>
+        <w:t xml:space="preserve"> </w:t>
+      </w:r>
+      <w:r>
+        <w:t xml:space="preserve">- DR coverage:</w:t>
+      </w:r>
+      <w:r>
+        <w:t xml:space="preserve"> </w:t>
+      </w:r>
+      <w:r>
+        <w:rPr>
+          <w:bCs/>
+          <w:b/>
+        </w:rPr>
+        <w:t xml:space="preserve">HC-6</w:t>
+      </w:r>
+      <w:r>
+        <w:t xml:space="preserve"> </w:t>
+      </w:r>
+      <w:r>
+        <w:t xml:space="preserve">evaluated per domain — the DR Foundation set (DR-021) plus the domain’s own CVAL/DR shared set, never double-counting the shared set</w:t>
+      </w:r>
+      <w:r>
+        <w:t xml:space="preserve"> </w:t>
+      </w:r>
+      <w:r>
+        <w:t xml:space="preserve">- VM-level:</w:t>
+      </w:r>
+      <w:r>
+        <w:t xml:space="preserve"> </w:t>
+      </w:r>
+      <w:r>
+        <w:rPr>
+          <w:bCs/>
+          <w:b/>
+        </w:rPr>
+        <w:t xml:space="preserve">HC-11</w:t>
+      </w:r>
+      <w:r>
+        <w:t xml:space="preserve"> </w:t>
+      </w:r>
+      <w:r>
+        <w:t xml:space="preserve">applied at onboarding per domain ig</w:t>
+      </w:r>
+    </w:p>
+    <w:p>
+      <w:pPr>
+        <w:pStyle w:val="BodyText"/>
+      </w:pPr>
+      <w:r>
+        <w:rPr>
+          <w:bCs/>
+          <w:b/>
+        </w:rPr>
+        <w:t xml:space="preserve">Ordering (PLC-015).</w:t>
+      </w:r>
+      <w:r>
+        <w:t xml:space="preserve"> </w:t>
+      </w:r>
+      <w:r>
+        <w:t xml:space="preserve">CRV resolution strictly precedes DPB resolution for every deployment; cross-domain independence (DOM-003) and domain-bounded sharing (DOM-004) are guaranteed by scoping, not by any new gate.</w:t>
+      </w:r>
+    </w:p>
+    <w:p>
+      <w:r>
+        <w:pict>
+          <v:rect style="width:0;height:1.5pt" o:hralign="center" o:hrstd="t" o:hr="t"/>
+        </w:pict>
+      </w:r>
+    </w:p>
     <w:bookmarkEnd w:id="107"/>
-    <w:bookmarkStart w:id="108" w:name="X16bfbef3bf2b5383f94a65da7d1eff470082b28"/>
+    <w:bookmarkEnd w:id="108"/>
+    <w:bookmarkStart w:id="109" w:name="X16bfbef3bf2b5383f94a65da7d1eff470082b28"/>
     <w:p>
       <w:pPr>
         <w:pStyle w:val="Heading2"/>
@@ -12643,6 +13402,210 @@
           </w:p>
         </w:tc>
       </w:tr>
+      <w:tr>
+        <w:tc>
+          <w:tcPr/>
+          <w:p>
+            <w:pPr>
+              <w:pStyle w:val="Compact"/>
+              <w:jc w:val="left"/>
+            </w:pPr>
+            <w:r>
+              <w:rPr>
+                <w:bCs/>
+                <w:b/>
+              </w:rPr>
+              <w:t xml:space="preserve">VR-12</w:t>
+            </w:r>
+            <w:r>
+              <w:t xml:space="preserve"> </w:t>
+            </w:r>
+            <w:r>
+              <w:rPr>
+                <w:iCs/>
+                <w:i/>
+              </w:rPr>
+              <w:t xml:space="preserve">(v3.0)</w:t>
+            </w:r>
+          </w:p>
+        </w:tc>
+        <w:tc>
+          <w:tcPr/>
+          <w:p>
+            <w:pPr>
+              <w:pStyle w:val="Compact"/>
+              <w:jc w:val="left"/>
+            </w:pPr>
+            <w:r>
+              <w:t xml:space="preserve">CVAL/DR shared CRGs (CAP-025</w:t>
+            </w:r>
+            <w:r>
+              <w:t xml:space="preserve"> </w:t>
+            </w:r>
+            <w:r>
+              <w:rPr>
+                <w:rStyle w:val="VerbatimChar"/>
+              </w:rPr>
+              <w:t xml:space="preserve">crg-cvdr-*</w:t>
+            </w:r>
+            <w:r>
+              <w:t xml:space="preserve">) never cross domain boundaries; sharing is domain-bounded (DOM-004), enforced at DPB scope</w:t>
+            </w:r>
+          </w:p>
+        </w:tc>
+        <w:tc>
+          <w:tcPr/>
+          <w:p>
+            <w:pPr>
+              <w:pStyle w:val="Compact"/>
+              <w:jc w:val="left"/>
+            </w:pPr>
+            <w:r>
+              <w:t xml:space="preserve">Scoping rule (DOM-004) — not a new gate</w:t>
+            </w:r>
+          </w:p>
+        </w:tc>
+      </w:tr>
+      <w:tr>
+        <w:tc>
+          <w:tcPr/>
+          <w:p>
+            <w:pPr>
+              <w:pStyle w:val="Compact"/>
+              <w:jc w:val="left"/>
+            </w:pPr>
+            <w:r>
+              <w:rPr>
+                <w:bCs/>
+                <w:b/>
+              </w:rPr>
+              <w:t xml:space="preserve">VR-13</w:t>
+            </w:r>
+            <w:r>
+              <w:t xml:space="preserve"> </w:t>
+            </w:r>
+            <w:r>
+              <w:rPr>
+                <w:iCs/>
+                <w:i/>
+              </w:rPr>
+              <w:t xml:space="preserve">(v3.0)</w:t>
+            </w:r>
+          </w:p>
+        </w:tc>
+        <w:tc>
+          <w:tcPr/>
+          <w:p>
+            <w:pPr>
+              <w:pStyle w:val="Compact"/>
+              <w:jc w:val="left"/>
+            </w:pPr>
+            <w:r>
+              <w:t xml:space="preserve">Prod / CVAL-DR / DR Foundation CRG set types (CAP-025</w:t>
+            </w:r>
+            <w:r>
+              <w:t xml:space="preserve"> </w:t>
+            </w:r>
+            <w:r>
+              <w:rPr>
+                <w:rStyle w:val="VerbatimChar"/>
+              </w:rPr>
+              <w:t xml:space="preserve">crg-pr-*</w:t>
+            </w:r>
+            <w:r>
+              <w:t xml:space="preserve">,</w:t>
+            </w:r>
+            <w:r>
+              <w:t xml:space="preserve"> </w:t>
+            </w:r>
+            <w:r>
+              <w:rPr>
+                <w:rStyle w:val="VerbatimChar"/>
+              </w:rPr>
+              <w:t xml:space="preserve">crg-cvdr-*</w:t>
+            </w:r>
+            <w:r>
+              <w:t xml:space="preserve">,</w:t>
+            </w:r>
+            <w:r>
+              <w:t xml:space="preserve"> </w:t>
+            </w:r>
+            <w:r>
+              <w:rPr>
+                <w:rStyle w:val="VerbatimChar"/>
+              </w:rPr>
+              <w:t xml:space="preserve">crg-drf-*</w:t>
+            </w:r>
+            <w:r>
+              <w:t xml:space="preserve">) are never mixed within a domain ig; DR Foundation is never shared with CVAL until an approved DR declaration (DR-021)</w:t>
+            </w:r>
+          </w:p>
+        </w:tc>
+        <w:tc>
+          <w:tcPr/>
+          <w:p>
+            <w:pPr>
+              <w:pStyle w:val="Compact"/>
+              <w:jc w:val="left"/>
+            </w:pPr>
+            <w:r>
+              <w:t xml:space="preserve">Scoping rule (CAP-025/DR-021) — not a new gate</w:t>
+            </w:r>
+          </w:p>
+        </w:tc>
+      </w:tr>
+      <w:tr>
+        <w:tc>
+          <w:tcPr/>
+          <w:p>
+            <w:pPr>
+              <w:pStyle w:val="Compact"/>
+              <w:jc w:val="left"/>
+            </w:pPr>
+            <w:r>
+              <w:rPr>
+                <w:bCs/>
+                <w:b/>
+              </w:rPr>
+              <w:t xml:space="preserve">VR-14</w:t>
+            </w:r>
+            <w:r>
+              <w:t xml:space="preserve"> </w:t>
+            </w:r>
+            <w:r>
+              <w:rPr>
+                <w:iCs/>
+                <w:i/>
+              </w:rPr>
+              <w:t xml:space="preserve">(v3.0)</w:t>
+            </w:r>
+          </w:p>
+        </w:tc>
+        <w:tc>
+          <w:tcPr/>
+          <w:p>
+            <w:pPr>
+              <w:pStyle w:val="Compact"/>
+              <w:jc w:val="left"/>
+            </w:pPr>
+            <w:r>
+              <w:t xml:space="preserve">CRV resolution strictly precedes DPB resolution; a domain group never re-runs region selection (PLC-015, PLC-013)</w:t>
+            </w:r>
+          </w:p>
+        </w:tc>
+        <w:tc>
+          <w:tcPr/>
+          <w:p>
+            <w:pPr>
+              <w:pStyle w:val="Compact"/>
+              <w:jc w:val="left"/>
+            </w:pPr>
+            <w:r>
+              <w:t xml:space="preserve">Scoping rule (PLC-015) — not a new gate</w:t>
+            </w:r>
+          </w:p>
+        </w:tc>
+      </w:tr>
     </w:tbl>
     <w:p>
       <w:r>
@@ -12651,8 +13614,8 @@
         </w:pict>
       </w:r>
     </w:p>
-    <w:bookmarkEnd w:id="108"/>
-    <w:bookmarkStart w:id="111" w:name="part-5-poc-blockers-testing"/>
+    <w:bookmarkEnd w:id="109"/>
+    <w:bookmarkStart w:id="112" w:name="part-5-poc-blockers-testing"/>
     <w:p>
       <w:pPr>
         <w:pStyle w:val="Heading2"/>
@@ -12661,7 +13624,7 @@
         <w:t xml:space="preserve">Part 5 — POC Blockers &amp; Testing</w:t>
       </w:r>
     </w:p>
-    <w:bookmarkStart w:id="109" w:name="critical-poc-blockers"/>
+    <w:bookmarkStart w:id="110" w:name="critical-poc-blockers"/>
     <w:p>
       <w:pPr>
         <w:pStyle w:val="Heading3"/>
@@ -12881,8 +13844,8 @@
         </w:tc>
       </w:tr>
     </w:tbl>
-    <w:bookmarkEnd w:id="109"/>
-    <w:bookmarkStart w:id="110" w:name="poc-test-coverage"/>
+    <w:bookmarkEnd w:id="110"/>
+    <w:bookmarkStart w:id="111" w:name="poc-test-coverage"/>
     <w:p>
       <w:pPr>
         <w:pStyle w:val="Heading3"/>
@@ -12939,6 +13902,38 @@
       </w:r>
       <w:r>
         <w:t xml:space="preserve">(DEC-001 RESOLVED); validates weighted DR selection over Europe Standard regions and max-not-sum sizing at the Europe destination (DR-020, PLC-010b)</w:t>
+      </w:r>
+      <w:r>
+        <w:br/>
+      </w:r>
+      <w:r>
+        <w:rPr>
+          <w:bCs/>
+          <w:b/>
+        </w:rPr>
+        <w:t xml:space="preserve">POC-12 (v3.0):</w:t>
+      </w:r>
+      <w:r>
+        <w:t xml:space="preserve"> </w:t>
+      </w:r>
+      <w:r>
+        <w:t xml:space="preserve">Domain-scoped CRG sharing validation — CVAL/DR shared CRG set stays within one domain (DOM-004, CAP-025); attempts to share across domains must fail (Baseline §23, POC-012)</w:t>
+      </w:r>
+      <w:r>
+        <w:br/>
+      </w:r>
+      <w:r>
+        <w:rPr>
+          <w:bCs/>
+          <w:b/>
+        </w:rPr>
+        <w:t xml:space="preserve">POC-13 (v3.0):</w:t>
+      </w:r>
+      <w:r>
+        <w:t xml:space="preserve"> </w:t>
+      </w:r>
+      <w:r>
+        <w:t xml:space="preserve">Two-scope flow against a live multi-domain customer — CRV resolved once at customer scope, DPB evaluation per domain ig, PLC-015 ordering, QUA-015 central quota group draws (Baseline §23, POC-013)</w:t>
       </w:r>
       <w:r>
         <w:br/>
@@ -12980,9 +13975,9 @@
         </w:pict>
       </w:r>
     </w:p>
-    <w:bookmarkEnd w:id="110"/>
     <w:bookmarkEnd w:id="111"/>
-    <w:bookmarkStart w:id="114" w:name="part-6-configuration-policy"/>
+    <w:bookmarkEnd w:id="112"/>
+    <w:bookmarkStart w:id="115" w:name="part-6-configuration-policy"/>
     <w:p>
       <w:pPr>
         <w:pStyle w:val="Heading2"/>
@@ -12991,7 +13986,7 @@
         <w:t xml:space="preserve">Part 6 — Configuration &amp; Policy</w:t>
       </w:r>
     </w:p>
-    <w:bookmarkStart w:id="112" w:name="X4be3307512e7f52d64cb89aabc3920545a45b86"/>
+    <w:bookmarkStart w:id="113" w:name="X4be3307512e7f52d64cb89aabc3920545a45b86"/>
     <w:p>
       <w:pPr>
         <w:pStyle w:val="Heading3"/>
@@ -13521,6 +14516,780 @@
         <w:rPr>
           <w:rStyle w:val="FunctionTok"/>
         </w:rPr>
+        <w:t xml:space="preserve">},</w:t>
+      </w:r>
+      <w:r>
+        <w:br/>
+      </w:r>
+      <w:r>
+        <w:rPr>
+          <w:rStyle w:val="NormalTok"/>
+        </w:rPr>
+        <w:t xml:space="preserve">  </w:t>
+      </w:r>
+      <w:r>
+        <w:rPr>
+          <w:rStyle w:val="DataTypeTok"/>
+        </w:rPr>
+        <w:t xml:space="preserve">"two_scope_v3_0"</w:t>
+      </w:r>
+      <w:r>
+        <w:rPr>
+          <w:rStyle w:val="FunctionTok"/>
+        </w:rPr>
+        <w:t xml:space="preserve">:</w:t>
+      </w:r>
+      <w:r>
+        <w:rPr>
+          <w:rStyle w:val="NormalTok"/>
+        </w:rPr>
+        <w:t xml:space="preserve"> </w:t>
+      </w:r>
+      <w:r>
+        <w:rPr>
+          <w:rStyle w:val="FunctionTok"/>
+        </w:rPr>
+        <w:t xml:space="preserve">{</w:t>
+      </w:r>
+      <w:r>
+        <w:br/>
+      </w:r>
+      <w:r>
+        <w:rPr>
+          <w:rStyle w:val="NormalTok"/>
+        </w:rPr>
+        <w:t xml:space="preserve">    </w:t>
+      </w:r>
+      <w:r>
+        <w:rPr>
+          <w:rStyle w:val="DataTypeTok"/>
+        </w:rPr>
+        <w:t xml:space="preserve">"crv_scope"</w:t>
+      </w:r>
+      <w:r>
+        <w:rPr>
+          <w:rStyle w:val="FunctionTok"/>
+        </w:rPr>
+        <w:t xml:space="preserve">:</w:t>
+      </w:r>
+      <w:r>
+        <w:rPr>
+          <w:rStyle w:val="NormalTok"/>
+        </w:rPr>
+        <w:t xml:space="preserve"> </w:t>
+      </w:r>
+      <w:r>
+        <w:rPr>
+          <w:rStyle w:val="FunctionTok"/>
+        </w:rPr>
+        <w:t xml:space="preserve">{</w:t>
+      </w:r>
+      <w:r>
+        <w:br/>
+      </w:r>
+      <w:r>
+        <w:rPr>
+          <w:rStyle w:val="NormalTok"/>
+        </w:rPr>
+        <w:t xml:space="preserve">      </w:t>
+      </w:r>
+      <w:r>
+        <w:rPr>
+          <w:rStyle w:val="DataTypeTok"/>
+        </w:rPr>
+        <w:t xml:space="preserve">"description"</w:t>
+      </w:r>
+      <w:r>
+        <w:rPr>
+          <w:rStyle w:val="FunctionTok"/>
+        </w:rPr>
+        <w:t xml:space="preserve">:</w:t>
+      </w:r>
+      <w:r>
+        <w:rPr>
+          <w:rStyle w:val="NormalTok"/>
+        </w:rPr>
+        <w:t xml:space="preserve"> </w:t>
+      </w:r>
+      <w:r>
+        <w:rPr>
+          <w:rStyle w:val="StringTok"/>
+        </w:rPr>
+        <w:t xml:space="preserve">"Customer-scoped region vector (PLC-013) — region gates evaluated once per customer × geography"</w:t>
+      </w:r>
+      <w:r>
+        <w:rPr>
+          <w:rStyle w:val="FunctionTok"/>
+        </w:rPr>
+        <w:t xml:space="preserve">,</w:t>
+      </w:r>
+      <w:r>
+        <w:br/>
+      </w:r>
+      <w:r>
+        <w:rPr>
+          <w:rStyle w:val="NormalTok"/>
+        </w:rPr>
+        <w:t xml:space="preserve">      </w:t>
+      </w:r>
+      <w:r>
+        <w:rPr>
+          <w:rStyle w:val="DataTypeTok"/>
+        </w:rPr>
+        <w:t xml:space="preserve">"stages"</w:t>
+      </w:r>
+      <w:r>
+        <w:rPr>
+          <w:rStyle w:val="FunctionTok"/>
+        </w:rPr>
+        <w:t xml:space="preserve">:</w:t>
+      </w:r>
+      <w:r>
+        <w:rPr>
+          <w:rStyle w:val="NormalTok"/>
+        </w:rPr>
+        <w:t xml:space="preserve"> </w:t>
+      </w:r>
+      <w:r>
+        <w:rPr>
+          <w:rStyle w:val="OtherTok"/>
+        </w:rPr>
+        <w:t xml:space="preserve">[</w:t>
+      </w:r>
+      <w:r>
+        <w:rPr>
+          <w:rStyle w:val="StringTok"/>
+        </w:rPr>
+        <w:t xml:space="preserve">"HC-8"</w:t>
+      </w:r>
+      <w:r>
+        <w:rPr>
+          <w:rStyle w:val="OtherTok"/>
+        </w:rPr>
+        <w:t xml:space="preserve">,</w:t>
+      </w:r>
+      <w:r>
+        <w:rPr>
+          <w:rStyle w:val="NormalTok"/>
+        </w:rPr>
+        <w:t xml:space="preserve"> </w:t>
+      </w:r>
+      <w:r>
+        <w:rPr>
+          <w:rStyle w:val="StringTok"/>
+        </w:rPr>
+        <w:t xml:space="preserve">"HC-9"</w:t>
+      </w:r>
+      <w:r>
+        <w:rPr>
+          <w:rStyle w:val="OtherTok"/>
+        </w:rPr>
+        <w:t xml:space="preserve">,</w:t>
+      </w:r>
+      <w:r>
+        <w:rPr>
+          <w:rStyle w:val="NormalTok"/>
+        </w:rPr>
+        <w:t xml:space="preserve"> </w:t>
+      </w:r>
+      <w:r>
+        <w:rPr>
+          <w:rStyle w:val="StringTok"/>
+        </w:rPr>
+        <w:t xml:space="preserve">"HC-1"</w:t>
+      </w:r>
+      <w:r>
+        <w:rPr>
+          <w:rStyle w:val="OtherTok"/>
+        </w:rPr>
+        <w:t xml:space="preserve">,</w:t>
+      </w:r>
+      <w:r>
+        <w:rPr>
+          <w:rStyle w:val="NormalTok"/>
+        </w:rPr>
+        <w:t xml:space="preserve"> </w:t>
+      </w:r>
+      <w:r>
+        <w:rPr>
+          <w:rStyle w:val="StringTok"/>
+        </w:rPr>
+        <w:t xml:space="preserve">"HC-4"</w:t>
+      </w:r>
+      <w:r>
+        <w:rPr>
+          <w:rStyle w:val="OtherTok"/>
+        </w:rPr>
+        <w:t xml:space="preserve">,</w:t>
+      </w:r>
+      <w:r>
+        <w:rPr>
+          <w:rStyle w:val="NormalTok"/>
+        </w:rPr>
+        <w:t xml:space="preserve"> </w:t>
+      </w:r>
+      <w:r>
+        <w:rPr>
+          <w:rStyle w:val="StringTok"/>
+        </w:rPr>
+        <w:t xml:space="preserve">"HC-5"</w:t>
+      </w:r>
+      <w:r>
+        <w:rPr>
+          <w:rStyle w:val="OtherTok"/>
+        </w:rPr>
+        <w:t xml:space="preserve">,</w:t>
+      </w:r>
+      <w:r>
+        <w:rPr>
+          <w:rStyle w:val="NormalTok"/>
+        </w:rPr>
+        <w:t xml:space="preserve"> </w:t>
+      </w:r>
+      <w:r>
+        <w:rPr>
+          <w:rStyle w:val="StringTok"/>
+        </w:rPr>
+        <w:t xml:space="preserve">"HC-10"</w:t>
+      </w:r>
+      <w:r>
+        <w:rPr>
+          <w:rStyle w:val="OtherTok"/>
+        </w:rPr>
+        <w:t xml:space="preserve">]</w:t>
+      </w:r>
+      <w:r>
+        <w:br/>
+      </w:r>
+      <w:r>
+        <w:rPr>
+          <w:rStyle w:val="NormalTok"/>
+        </w:rPr>
+        <w:t xml:space="preserve">    </w:t>
+      </w:r>
+      <w:r>
+        <w:rPr>
+          <w:rStyle w:val="FunctionTok"/>
+        </w:rPr>
+        <w:t xml:space="preserve">},</w:t>
+      </w:r>
+      <w:r>
+        <w:br/>
+      </w:r>
+      <w:r>
+        <w:rPr>
+          <w:rStyle w:val="NormalTok"/>
+        </w:rPr>
+        <w:t xml:space="preserve">    </w:t>
+      </w:r>
+      <w:r>
+        <w:rPr>
+          <w:rStyle w:val="DataTypeTok"/>
+        </w:rPr>
+        <w:t xml:space="preserve">"dpb_scope"</w:t>
+      </w:r>
+      <w:r>
+        <w:rPr>
+          <w:rStyle w:val="FunctionTok"/>
+        </w:rPr>
+        <w:t xml:space="preserve">:</w:t>
+      </w:r>
+      <w:r>
+        <w:rPr>
+          <w:rStyle w:val="NormalTok"/>
+        </w:rPr>
+        <w:t xml:space="preserve"> </w:t>
+      </w:r>
+      <w:r>
+        <w:rPr>
+          <w:rStyle w:val="FunctionTok"/>
+        </w:rPr>
+        <w:t xml:space="preserve">{</w:t>
+      </w:r>
+      <w:r>
+        <w:br/>
+      </w:r>
+      <w:r>
+        <w:rPr>
+          <w:rStyle w:val="NormalTok"/>
+        </w:rPr>
+        <w:t xml:space="preserve">      </w:t>
+      </w:r>
+      <w:r>
+        <w:rPr>
+          <w:rStyle w:val="DataTypeTok"/>
+        </w:rPr>
+        <w:t xml:space="preserve">"description"</w:t>
+      </w:r>
+      <w:r>
+        <w:rPr>
+          <w:rStyle w:val="FunctionTok"/>
+        </w:rPr>
+        <w:t xml:space="preserve">:</w:t>
+      </w:r>
+      <w:r>
+        <w:rPr>
+          <w:rStyle w:val="NormalTok"/>
+        </w:rPr>
+        <w:t xml:space="preserve"> </w:t>
+      </w:r>
+      <w:r>
+        <w:rPr>
+          <w:rStyle w:val="StringTok"/>
+        </w:rPr>
+        <w:t xml:space="preserve">"Domain Placement Binding (PLC-014) — capacity/quota gates per domain × environment × region"</w:t>
+      </w:r>
+      <w:r>
+        <w:rPr>
+          <w:rStyle w:val="FunctionTok"/>
+        </w:rPr>
+        <w:t xml:space="preserve">,</w:t>
+      </w:r>
+      <w:r>
+        <w:br/>
+      </w:r>
+      <w:r>
+        <w:rPr>
+          <w:rStyle w:val="NormalTok"/>
+        </w:rPr>
+        <w:t xml:space="preserve">      </w:t>
+      </w:r>
+      <w:r>
+        <w:rPr>
+          <w:rStyle w:val="DataTypeTok"/>
+        </w:rPr>
+        <w:t xml:space="preserve">"stages"</w:t>
+      </w:r>
+      <w:r>
+        <w:rPr>
+          <w:rStyle w:val="FunctionTok"/>
+        </w:rPr>
+        <w:t xml:space="preserve">:</w:t>
+      </w:r>
+      <w:r>
+        <w:rPr>
+          <w:rStyle w:val="NormalTok"/>
+        </w:rPr>
+        <w:t xml:space="preserve"> </w:t>
+      </w:r>
+      <w:r>
+        <w:rPr>
+          <w:rStyle w:val="OtherTok"/>
+        </w:rPr>
+        <w:t xml:space="preserve">[</w:t>
+      </w:r>
+      <w:r>
+        <w:rPr>
+          <w:rStyle w:val="StringTok"/>
+        </w:rPr>
+        <w:t xml:space="preserve">"HC-2"</w:t>
+      </w:r>
+      <w:r>
+        <w:rPr>
+          <w:rStyle w:val="OtherTok"/>
+        </w:rPr>
+        <w:t xml:space="preserve">,</w:t>
+      </w:r>
+      <w:r>
+        <w:rPr>
+          <w:rStyle w:val="NormalTok"/>
+        </w:rPr>
+        <w:t xml:space="preserve"> </w:t>
+      </w:r>
+      <w:r>
+        <w:rPr>
+          <w:rStyle w:val="StringTok"/>
+        </w:rPr>
+        <w:t xml:space="preserve">"HC-3"</w:t>
+      </w:r>
+      <w:r>
+        <w:rPr>
+          <w:rStyle w:val="OtherTok"/>
+        </w:rPr>
+        <w:t xml:space="preserve">,</w:t>
+      </w:r>
+      <w:r>
+        <w:rPr>
+          <w:rStyle w:val="NormalTok"/>
+        </w:rPr>
+        <w:t xml:space="preserve"> </w:t>
+      </w:r>
+      <w:r>
+        <w:rPr>
+          <w:rStyle w:val="StringTok"/>
+        </w:rPr>
+        <w:t xml:space="preserve">"HC-6"</w:t>
+      </w:r>
+      <w:r>
+        <w:rPr>
+          <w:rStyle w:val="OtherTok"/>
+        </w:rPr>
+        <w:t xml:space="preserve">,</w:t>
+      </w:r>
+      <w:r>
+        <w:rPr>
+          <w:rStyle w:val="NormalTok"/>
+        </w:rPr>
+        <w:t xml:space="preserve"> </w:t>
+      </w:r>
+      <w:r>
+        <w:rPr>
+          <w:rStyle w:val="StringTok"/>
+        </w:rPr>
+        <w:t xml:space="preserve">"HC-7"</w:t>
+      </w:r>
+      <w:r>
+        <w:rPr>
+          <w:rStyle w:val="OtherTok"/>
+        </w:rPr>
+        <w:t xml:space="preserve">,</w:t>
+      </w:r>
+      <w:r>
+        <w:rPr>
+          <w:rStyle w:val="NormalTok"/>
+        </w:rPr>
+        <w:t xml:space="preserve"> </w:t>
+      </w:r>
+      <w:r>
+        <w:rPr>
+          <w:rStyle w:val="StringTok"/>
+        </w:rPr>
+        <w:t xml:space="preserve">"HC-11"</w:t>
+      </w:r>
+      <w:r>
+        <w:rPr>
+          <w:rStyle w:val="OtherTok"/>
+        </w:rPr>
+        <w:t xml:space="preserve">]</w:t>
+      </w:r>
+      <w:r>
+        <w:br/>
+      </w:r>
+      <w:r>
+        <w:rPr>
+          <w:rStyle w:val="NormalTok"/>
+        </w:rPr>
+        <w:t xml:space="preserve">    </w:t>
+      </w:r>
+      <w:r>
+        <w:rPr>
+          <w:rStyle w:val="FunctionTok"/>
+        </w:rPr>
+        <w:t xml:space="preserve">},</w:t>
+      </w:r>
+      <w:r>
+        <w:br/>
+      </w:r>
+      <w:r>
+        <w:rPr>
+          <w:rStyle w:val="NormalTok"/>
+        </w:rPr>
+        <w:t xml:space="preserve">    </w:t>
+      </w:r>
+      <w:r>
+        <w:rPr>
+          <w:rStyle w:val="DataTypeTok"/>
+        </w:rPr>
+        <w:t xml:space="preserve">"resolution_order"</w:t>
+      </w:r>
+      <w:r>
+        <w:rPr>
+          <w:rStyle w:val="FunctionTok"/>
+        </w:rPr>
+        <w:t xml:space="preserve">:</w:t>
+      </w:r>
+      <w:r>
+        <w:rPr>
+          <w:rStyle w:val="NormalTok"/>
+        </w:rPr>
+        <w:t xml:space="preserve"> </w:t>
+      </w:r>
+      <w:r>
+        <w:rPr>
+          <w:rStyle w:val="StringTok"/>
+        </w:rPr>
+        <w:t xml:space="preserve">"CRV strictly precedes DPB (PLC-015, VR-14)"</w:t>
+      </w:r>
+      <w:r>
+        <w:rPr>
+          <w:rStyle w:val="FunctionTok"/>
+        </w:rPr>
+        <w:t xml:space="preserve">,</w:t>
+      </w:r>
+      <w:r>
+        <w:br/>
+      </w:r>
+      <w:r>
+        <w:rPr>
+          <w:rStyle w:val="NormalTok"/>
+        </w:rPr>
+        <w:t xml:space="preserve">    </w:t>
+      </w:r>
+      <w:r>
+        <w:rPr>
+          <w:rStyle w:val="DataTypeTok"/>
+        </w:rPr>
+        <w:t xml:space="preserve">"domain_taxonomy_tokens"</w:t>
+      </w:r>
+      <w:r>
+        <w:rPr>
+          <w:rStyle w:val="FunctionTok"/>
+        </w:rPr>
+        <w:t xml:space="preserve">:</w:t>
+      </w:r>
+      <w:r>
+        <w:rPr>
+          <w:rStyle w:val="NormalTok"/>
+        </w:rPr>
+        <w:t xml:space="preserve"> </w:t>
+      </w:r>
+      <w:r>
+        <w:rPr>
+          <w:rStyle w:val="StringTok"/>
+        </w:rPr>
+        <w:t xml:space="preserve">"wl-* per domain group (DOM-001); optional function-group &lt;fn&gt; (C-14, DEC-004)"</w:t>
+      </w:r>
+      <w:r>
+        <w:rPr>
+          <w:rStyle w:val="FunctionTok"/>
+        </w:rPr>
+        <w:t xml:space="preserve">,</w:t>
+      </w:r>
+      <w:r>
+        <w:br/>
+      </w:r>
+      <w:r>
+        <w:rPr>
+          <w:rStyle w:val="NormalTok"/>
+        </w:rPr>
+        <w:t xml:space="preserve">    </w:t>
+      </w:r>
+      <w:r>
+        <w:rPr>
+          <w:rStyle w:val="DataTypeTok"/>
+        </w:rPr>
+        <w:t xml:space="preserve">"dr_foundation_sizing_basis"</w:t>
+      </w:r>
+      <w:r>
+        <w:rPr>
+          <w:rStyle w:val="FunctionTok"/>
+        </w:rPr>
+        <w:t xml:space="preserve">:</w:t>
+      </w:r>
+      <w:r>
+        <w:rPr>
+          <w:rStyle w:val="NormalTok"/>
+        </w:rPr>
+        <w:t xml:space="preserve"> </w:t>
+      </w:r>
+      <w:r>
+        <w:rPr>
+          <w:rStyle w:val="StringTok"/>
+        </w:rPr>
+        <w:t xml:space="preserve">"configurable bootstrap per product/domain/region/zone/SKU (C-16, DR-021, ENV-005/DR-007)"</w:t>
+      </w:r>
+      <w:r>
+        <w:rPr>
+          <w:rStyle w:val="FunctionTok"/>
+        </w:rPr>
+        <w:t xml:space="preserve">,</w:t>
+      </w:r>
+      <w:r>
+        <w:br/>
+      </w:r>
+      <w:r>
+        <w:rPr>
+          <w:rStyle w:val="NormalTok"/>
+        </w:rPr>
+        <w:t xml:space="preserve">    </w:t>
+      </w:r>
+      <w:r>
+        <w:rPr>
+          <w:rStyle w:val="DataTypeTok"/>
+        </w:rPr>
+        <w:t xml:space="preserve">"combined_region_load_observation_threshold"</w:t>
+      </w:r>
+      <w:r>
+        <w:rPr>
+          <w:rStyle w:val="FunctionTok"/>
+        </w:rPr>
+        <w:t xml:space="preserve">:</w:t>
+      </w:r>
+      <w:r>
+        <w:rPr>
+          <w:rStyle w:val="NormalTok"/>
+        </w:rPr>
+        <w:t xml:space="preserve"> </w:t>
+      </w:r>
+      <w:r>
+        <w:rPr>
+          <w:rStyle w:val="StringTok"/>
+        </w:rPr>
+        <w:t xml:space="preserve">"deviation threshold for cross-domain region-level alert (C-15, PLC-016/OBS-002)"</w:t>
+      </w:r>
+      <w:r>
+        <w:rPr>
+          <w:rStyle w:val="FunctionTok"/>
+        </w:rPr>
+        <w:t xml:space="preserve">,</w:t>
+      </w:r>
+      <w:r>
+        <w:br/>
+      </w:r>
+      <w:r>
+        <w:rPr>
+          <w:rStyle w:val="NormalTok"/>
+        </w:rPr>
+        <w:t xml:space="preserve">    </w:t>
+      </w:r>
+      <w:r>
+        <w:rPr>
+          <w:rStyle w:val="DataTypeTok"/>
+        </w:rPr>
+        <w:t xml:space="preserve">"quota_group"</w:t>
+      </w:r>
+      <w:r>
+        <w:rPr>
+          <w:rStyle w:val="FunctionTok"/>
+        </w:rPr>
+        <w:t xml:space="preserve">:</w:t>
+      </w:r>
+      <w:r>
+        <w:rPr>
+          <w:rStyle w:val="NormalTok"/>
+        </w:rPr>
+        <w:t xml:space="preserve"> </w:t>
+      </w:r>
+      <w:r>
+        <w:rPr>
+          <w:rStyle w:val="FunctionTok"/>
+        </w:rPr>
+        <w:t xml:space="preserve">{</w:t>
+      </w:r>
+      <w:r>
+        <w:br/>
+      </w:r>
+      <w:r>
+        <w:rPr>
+          <w:rStyle w:val="NormalTok"/>
+        </w:rPr>
+        <w:t xml:space="preserve">      </w:t>
+      </w:r>
+      <w:r>
+        <w:rPr>
+          <w:rStyle w:val="DataTypeTok"/>
+        </w:rPr>
+        <w:t xml:space="preserve">"model"</w:t>
+      </w:r>
+      <w:r>
+        <w:rPr>
+          <w:rStyle w:val="FunctionTok"/>
+        </w:rPr>
+        <w:t xml:space="preserve">:</w:t>
+      </w:r>
+      <w:r>
+        <w:rPr>
+          <w:rStyle w:val="NormalTok"/>
+        </w:rPr>
+        <w:t xml:space="preserve"> </w:t>
+      </w:r>
+      <w:r>
+        <w:rPr>
+          <w:rStyle w:val="StringTok"/>
+        </w:rPr>
+        <w:t xml:space="preserve">"customer-central quota group per region × VM-family cell (QUA-015) spanning all domain ig subscriptions"</w:t>
+      </w:r>
+      <w:r>
+        <w:rPr>
+          <w:rStyle w:val="FunctionTok"/>
+        </w:rPr>
+        <w:t xml:space="preserve">,</w:t>
+      </w:r>
+      <w:r>
+        <w:br/>
+      </w:r>
+      <w:r>
+        <w:rPr>
+          <w:rStyle w:val="NormalTok"/>
+        </w:rPr>
+        <w:t xml:space="preserve">      </w:t>
+      </w:r>
+      <w:r>
+        <w:rPr>
+          <w:rStyle w:val="DataTypeTok"/>
+        </w:rPr>
+        <w:t xml:space="preserve">"GROUP_REPLENISH_THRESHOLD"</w:t>
+      </w:r>
+      <w:r>
+        <w:rPr>
+          <w:rStyle w:val="FunctionTok"/>
+        </w:rPr>
+        <w:t xml:space="preserve">:</w:t>
+      </w:r>
+      <w:r>
+        <w:rPr>
+          <w:rStyle w:val="NormalTok"/>
+        </w:rPr>
+        <w:t xml:space="preserve"> </w:t>
+      </w:r>
+      <w:r>
+        <w:rPr>
+          <w:rStyle w:val="StringTok"/>
+        </w:rPr>
+        <w:t xml:space="preserve">"0.85 (default 85%)"</w:t>
+      </w:r>
+      <w:r>
+        <w:rPr>
+          <w:rStyle w:val="FunctionTok"/>
+        </w:rPr>
+        <w:t xml:space="preserve">,</w:t>
+      </w:r>
+      <w:r>
+        <w:br/>
+      </w:r>
+      <w:r>
+        <w:rPr>
+          <w:rStyle w:val="NormalTok"/>
+        </w:rPr>
+        <w:t xml:space="preserve">      </w:t>
+      </w:r>
+      <w:r>
+        <w:rPr>
+          <w:rStyle w:val="DataTypeTok"/>
+        </w:rPr>
+        <w:t xml:space="preserve">"SUB_REPLENISH_THRESHOLD"</w:t>
+      </w:r>
+      <w:r>
+        <w:rPr>
+          <w:rStyle w:val="FunctionTok"/>
+        </w:rPr>
+        <w:t xml:space="preserve">:</w:t>
+      </w:r>
+      <w:r>
+        <w:rPr>
+          <w:rStyle w:val="NormalTok"/>
+        </w:rPr>
+        <w:t xml:space="preserve"> </w:t>
+      </w:r>
+      <w:r>
+        <w:rPr>
+          <w:rStyle w:val="StringTok"/>
+        </w:rPr>
+        <w:t xml:space="preserve">"0.85 (default 85%)"</w:t>
+      </w:r>
+      <w:r>
+        <w:br/>
+      </w:r>
+      <w:r>
+        <w:rPr>
+          <w:rStyle w:val="NormalTok"/>
+        </w:rPr>
+        <w:t xml:space="preserve">    </w:t>
+      </w:r>
+      <w:r>
+        <w:rPr>
+          <w:rStyle w:val="FunctionTok"/>
+        </w:rPr>
         <w:t xml:space="preserve">}</w:t>
       </w:r>
       <w:r>
@@ -13528,13 +15297,28 @@
       </w:r>
       <w:r>
         <w:rPr>
+          <w:rStyle w:val="NormalTok"/>
+        </w:rPr>
+        <w:t xml:space="preserve">  </w:t>
+      </w:r>
+      <w:r>
+        <w:rPr>
           <w:rStyle w:val="FunctionTok"/>
         </w:rPr>
         <w:t xml:space="preserve">}</w:t>
       </w:r>
-    </w:p>
-    <w:bookmarkEnd w:id="112"/>
-    <w:bookmarkStart w:id="113" w:name="policy-constants-1"/>
+      <w:r>
+        <w:br/>
+      </w:r>
+      <w:r>
+        <w:rPr>
+          <w:rStyle w:val="FunctionTok"/>
+        </w:rPr>
+        <w:t xml:space="preserve">}</w:t>
+      </w:r>
+    </w:p>
+    <w:bookmarkEnd w:id="113"/>
+    <w:bookmarkStart w:id="114" w:name="policy-constants-1"/>
     <w:p>
       <w:pPr>
         <w:pStyle w:val="Heading3"/>
@@ -14003,6 +15787,478 @@
           </w:p>
         </w:tc>
       </w:tr>
+      <w:tr>
+        <w:tc>
+          <w:tcPr/>
+          <w:p>
+            <w:pPr>
+              <w:pStyle w:val="Compact"/>
+              <w:jc w:val="left"/>
+            </w:pPr>
+            <w:r>
+              <w:rPr>
+                <w:bCs/>
+                <w:b/>
+              </w:rPr>
+              <w:t xml:space="preserve">crv_scope_gates</w:t>
+            </w:r>
+            <w:r>
+              <w:t xml:space="preserve"> </w:t>
+            </w:r>
+            <w:r>
+              <w:rPr>
+                <w:iCs/>
+                <w:i/>
+              </w:rPr>
+              <w:t xml:space="preserve">(v3.0)</w:t>
+            </w:r>
+          </w:p>
+        </w:tc>
+        <w:tc>
+          <w:tcPr/>
+          <w:p>
+            <w:pPr>
+              <w:pStyle w:val="Compact"/>
+              <w:jc w:val="left"/>
+            </w:pPr>
+            <w:r>
+              <w:t xml:space="preserve">HC-8, HC-9, HC-1, HC-4, HC-5, HC-10 evaluated once per customer × geography (PLC-013)</w:t>
+            </w:r>
+          </w:p>
+        </w:tc>
+        <w:tc>
+          <w:tcPr/>
+          <w:p>
+            <w:pPr>
+              <w:pStyle w:val="Compact"/>
+              <w:jc w:val="left"/>
+            </w:pPr>
+            <w:r>
+              <w:t xml:space="preserve">✅ Yes (config lists)</w:t>
+            </w:r>
+          </w:p>
+        </w:tc>
+        <w:tc>
+          <w:tcPr/>
+          <w:p>
+            <w:pPr>
+              <w:pStyle w:val="Compact"/>
+              <w:jc w:val="left"/>
+            </w:pPr>
+            <w:r>
+              <w:t xml:space="preserve">HC-1, HC-4, HC-5, HC-8, HC-9, HC-10</w:t>
+            </w:r>
+          </w:p>
+        </w:tc>
+      </w:tr>
+      <w:tr>
+        <w:tc>
+          <w:tcPr/>
+          <w:p>
+            <w:pPr>
+              <w:pStyle w:val="Compact"/>
+              <w:jc w:val="left"/>
+            </w:pPr>
+            <w:r>
+              <w:rPr>
+                <w:bCs/>
+                <w:b/>
+              </w:rPr>
+              <w:t xml:space="preserve">dpb_scope_gates</w:t>
+            </w:r>
+            <w:r>
+              <w:t xml:space="preserve"> </w:t>
+            </w:r>
+            <w:r>
+              <w:rPr>
+                <w:iCs/>
+                <w:i/>
+              </w:rPr>
+              <w:t xml:space="preserve">(v3.0)</w:t>
+            </w:r>
+          </w:p>
+        </w:tc>
+        <w:tc>
+          <w:tcPr/>
+          <w:p>
+            <w:pPr>
+              <w:pStyle w:val="Compact"/>
+              <w:jc w:val="left"/>
+            </w:pPr>
+            <w:r>
+              <w:t xml:space="preserve">HC-2, HC-3, HC-6, HC-7, HC-11 evaluated per domain × environment × region (PLC-014)</w:t>
+            </w:r>
+          </w:p>
+        </w:tc>
+        <w:tc>
+          <w:tcPr/>
+          <w:p>
+            <w:pPr>
+              <w:pStyle w:val="Compact"/>
+              <w:jc w:val="left"/>
+            </w:pPr>
+            <w:r>
+              <w:t xml:space="preserve">✅ Yes (config lists)</w:t>
+            </w:r>
+          </w:p>
+        </w:tc>
+        <w:tc>
+          <w:tcPr/>
+          <w:p>
+            <w:pPr>
+              <w:pStyle w:val="Compact"/>
+              <w:jc w:val="left"/>
+            </w:pPr>
+            <w:r>
+              <w:t xml:space="preserve">HC-2, HC-3, HC-6, HC-7, HC-11</w:t>
+            </w:r>
+          </w:p>
+        </w:tc>
+      </w:tr>
+      <w:tr>
+        <w:tc>
+          <w:tcPr/>
+          <w:p>
+            <w:pPr>
+              <w:pStyle w:val="Compact"/>
+              <w:jc w:val="left"/>
+            </w:pPr>
+            <w:r>
+              <w:rPr>
+                <w:bCs/>
+                <w:b/>
+              </w:rPr>
+              <w:t xml:space="preserve">resolution_order</w:t>
+            </w:r>
+            <w:r>
+              <w:t xml:space="preserve"> </w:t>
+            </w:r>
+            <w:r>
+              <w:rPr>
+                <w:iCs/>
+                <w:i/>
+              </w:rPr>
+              <w:t xml:space="preserve">(v3.0)</w:t>
+            </w:r>
+          </w:p>
+        </w:tc>
+        <w:tc>
+          <w:tcPr/>
+          <w:p>
+            <w:pPr>
+              <w:pStyle w:val="Compact"/>
+              <w:jc w:val="left"/>
+            </w:pPr>
+            <w:r>
+              <w:t xml:space="preserve">CRV strictly precedes DPB (PLC-015)</w:t>
+            </w:r>
+          </w:p>
+        </w:tc>
+        <w:tc>
+          <w:tcPr/>
+          <w:p>
+            <w:pPr>
+              <w:pStyle w:val="Compact"/>
+              <w:jc w:val="left"/>
+            </w:pPr>
+            <w:r>
+              <w:t xml:space="preserve">✅ Yes (gate)</w:t>
+            </w:r>
+          </w:p>
+        </w:tc>
+        <w:tc>
+          <w:tcPr/>
+          <w:p>
+            <w:pPr>
+              <w:pStyle w:val="Compact"/>
+              <w:jc w:val="left"/>
+            </w:pPr>
+            <w:r>
+              <w:t xml:space="preserve">— (ordering; VR-14)</w:t>
+            </w:r>
+          </w:p>
+        </w:tc>
+      </w:tr>
+      <w:tr>
+        <w:tc>
+          <w:tcPr/>
+          <w:p>
+            <w:pPr>
+              <w:pStyle w:val="Compact"/>
+              <w:jc w:val="left"/>
+            </w:pPr>
+            <w:r>
+              <w:rPr>
+                <w:bCs/>
+                <w:b/>
+              </w:rPr>
+              <w:t xml:space="preserve">domain_taxonomy_tokens</w:t>
+            </w:r>
+            <w:r>
+              <w:t xml:space="preserve"> </w:t>
+            </w:r>
+            <w:r>
+              <w:rPr>
+                <w:iCs/>
+                <w:i/>
+              </w:rPr>
+              <w:t xml:space="preserve">(v3.0)</w:t>
+            </w:r>
+          </w:p>
+        </w:tc>
+        <w:tc>
+          <w:tcPr/>
+          <w:p>
+            <w:pPr>
+              <w:pStyle w:val="Compact"/>
+              <w:jc w:val="left"/>
+            </w:pPr>
+            <w:r>
+              <w:rPr>
+                <w:rStyle w:val="VerbatimChar"/>
+              </w:rPr>
+              <w:t xml:space="preserve">wl-*</w:t>
+            </w:r>
+            <w:r>
+              <w:t xml:space="preserve"> </w:t>
+            </w:r>
+            <w:r>
+              <w:t xml:space="preserve">per domain group; optional</w:t>
+            </w:r>
+            <w:r>
+              <w:t xml:space="preserve"> </w:t>
+            </w:r>
+            <w:r>
+              <w:rPr>
+                <w:rStyle w:val="VerbatimChar"/>
+              </w:rPr>
+              <w:t xml:space="preserve">&lt;fn&gt;</w:t>
+            </w:r>
+            <w:r>
+              <w:t xml:space="preserve"> </w:t>
+            </w:r>
+            <w:r>
+              <w:t xml:space="preserve">(DOM-001)</w:t>
+            </w:r>
+          </w:p>
+        </w:tc>
+        <w:tc>
+          <w:tcPr/>
+          <w:p>
+            <w:pPr>
+              <w:pStyle w:val="Compact"/>
+              <w:jc w:val="left"/>
+            </w:pPr>
+            <w:r>
+              <w:t xml:space="preserve">✅ Yes (C-14, DEC-004)</w:t>
+            </w:r>
+          </w:p>
+        </w:tc>
+        <w:tc>
+          <w:tcPr/>
+          <w:p>
+            <w:pPr>
+              <w:pStyle w:val="Compact"/>
+              <w:jc w:val="left"/>
+            </w:pPr>
+            <w:r>
+              <w:t xml:space="preserve">— (scoping)</w:t>
+            </w:r>
+          </w:p>
+        </w:tc>
+      </w:tr>
+      <w:tr>
+        <w:tc>
+          <w:tcPr/>
+          <w:p>
+            <w:pPr>
+              <w:pStyle w:val="Compact"/>
+              <w:jc w:val="left"/>
+            </w:pPr>
+            <w:r>
+              <w:rPr>
+                <w:bCs/>
+                <w:b/>
+              </w:rPr>
+              <w:t xml:space="preserve">combined_region_load_observation_threshold</w:t>
+            </w:r>
+            <w:r>
+              <w:t xml:space="preserve"> </w:t>
+            </w:r>
+            <w:r>
+              <w:rPr>
+                <w:iCs/>
+                <w:i/>
+              </w:rPr>
+              <w:t xml:space="preserve">(v3.0)</w:t>
+            </w:r>
+          </w:p>
+        </w:tc>
+        <w:tc>
+          <w:tcPr/>
+          <w:p>
+            <w:pPr>
+              <w:pStyle w:val="Compact"/>
+              <w:jc w:val="left"/>
+            </w:pPr>
+            <w:r>
+              <w:t xml:space="preserve">Deviation alert threshold across a customer’s domains (PLC-016/OBS-002)</w:t>
+            </w:r>
+          </w:p>
+        </w:tc>
+        <w:tc>
+          <w:tcPr/>
+          <w:p>
+            <w:pPr>
+              <w:pStyle w:val="Compact"/>
+              <w:jc w:val="left"/>
+            </w:pPr>
+            <w:r>
+              <w:t xml:space="preserve">✅ Yes (C-15)</w:t>
+            </w:r>
+          </w:p>
+        </w:tc>
+        <w:tc>
+          <w:tcPr/>
+          <w:p>
+            <w:pPr>
+              <w:pStyle w:val="Compact"/>
+              <w:jc w:val="left"/>
+            </w:pPr>
+            <w:r>
+              <w:t xml:space="preserve">— (observation only)</w:t>
+            </w:r>
+          </w:p>
+        </w:tc>
+      </w:tr>
+      <w:tr>
+        <w:tc>
+          <w:tcPr/>
+          <w:p>
+            <w:pPr>
+              <w:pStyle w:val="Compact"/>
+              <w:jc w:val="left"/>
+            </w:pPr>
+            <w:r>
+              <w:rPr>
+                <w:bCs/>
+                <w:b/>
+              </w:rPr>
+              <w:t xml:space="preserve">dr_foundation_sizing_basis</w:t>
+            </w:r>
+            <w:r>
+              <w:t xml:space="preserve"> </w:t>
+            </w:r>
+            <w:r>
+              <w:rPr>
+                <w:iCs/>
+                <w:i/>
+              </w:rPr>
+              <w:t xml:space="preserve">(v3.0)</w:t>
+            </w:r>
+          </w:p>
+        </w:tc>
+        <w:tc>
+          <w:tcPr/>
+          <w:p>
+            <w:pPr>
+              <w:pStyle w:val="Compact"/>
+              <w:jc w:val="left"/>
+            </w:pPr>
+            <w:r>
+              <w:t xml:space="preserve">Configurable bootstrap per product/domain/region/zone/SKU (ENV-005/DR-007); never a fixed % (DR-021)</w:t>
+            </w:r>
+          </w:p>
+        </w:tc>
+        <w:tc>
+          <w:tcPr/>
+          <w:p>
+            <w:pPr>
+              <w:pStyle w:val="Compact"/>
+              <w:jc w:val="left"/>
+            </w:pPr>
+            <w:r>
+              <w:t xml:space="preserve">✅ Yes (C-16)</w:t>
+            </w:r>
+          </w:p>
+        </w:tc>
+        <w:tc>
+          <w:tcPr/>
+          <w:p>
+            <w:pPr>
+              <w:pStyle w:val="Compact"/>
+              <w:jc w:val="left"/>
+            </w:pPr>
+            <w:r>
+              <w:t xml:space="preserve">HC-6, HC-7 (floor coverage)</w:t>
+            </w:r>
+          </w:p>
+        </w:tc>
+      </w:tr>
+      <w:tr>
+        <w:tc>
+          <w:tcPr/>
+          <w:p>
+            <w:pPr>
+              <w:pStyle w:val="Compact"/>
+              <w:jc w:val="left"/>
+            </w:pPr>
+            <w:r>
+              <w:rPr>
+                <w:bCs/>
+                <w:b/>
+              </w:rPr>
+              <w:t xml:space="preserve">GROUP_REPLENISH_THRESHOLD / SUB_REPLENISH_THRESHOLD</w:t>
+            </w:r>
+            <w:r>
+              <w:t xml:space="preserve"> </w:t>
+            </w:r>
+            <w:r>
+              <w:rPr>
+                <w:iCs/>
+                <w:i/>
+              </w:rPr>
+              <w:t xml:space="preserve">(v3.0)</w:t>
+            </w:r>
+          </w:p>
+        </w:tc>
+        <w:tc>
+          <w:tcPr/>
+          <w:p>
+            <w:pPr>
+              <w:pStyle w:val="Compact"/>
+              <w:jc w:val="left"/>
+            </w:pPr>
+            <w:r>
+              <w:t xml:space="preserve">0.85 / 0.85 — central quota group replenishment at group and subscription level (QUA-015)</w:t>
+            </w:r>
+          </w:p>
+        </w:tc>
+        <w:tc>
+          <w:tcPr/>
+          <w:p>
+            <w:pPr>
+              <w:pStyle w:val="Compact"/>
+              <w:jc w:val="left"/>
+            </w:pPr>
+            <w:r>
+              <w:t xml:space="preserve">✅ Yes</w:t>
+            </w:r>
+          </w:p>
+        </w:tc>
+        <w:tc>
+          <w:tcPr/>
+          <w:p>
+            <w:pPr>
+              <w:pStyle w:val="Compact"/>
+              <w:jc w:val="left"/>
+            </w:pPr>
+            <w:r>
+              <w:t xml:space="preserve">HC-3, HC-7 (headroom)</w:t>
+            </w:r>
+          </w:p>
+        </w:tc>
+      </w:tr>
     </w:tbl>
     <w:p>
       <w:r>
@@ -14011,9 +16267,9 @@
         </w:pict>
       </w:r>
     </w:p>
-    <w:bookmarkEnd w:id="113"/>
     <w:bookmarkEnd w:id="114"/>
-    <w:bookmarkStart w:id="117" w:name="part-7-implementation-checklist"/>
+    <w:bookmarkEnd w:id="115"/>
+    <w:bookmarkStart w:id="118" w:name="part-7-implementation-checklist"/>
     <w:p>
       <w:pPr>
         <w:pStyle w:val="Heading2"/>
@@ -14022,7 +16278,7 @@
         <w:t xml:space="preserve">Part 7 — Implementation Checklist</w:t>
       </w:r>
     </w:p>
-    <w:bookmarkStart w:id="115" w:name="engineering-backlog-cross-reference"/>
+    <w:bookmarkStart w:id="116" w:name="engineering-backlog-cross-reference"/>
     <w:p>
       <w:pPr>
         <w:pStyle w:val="Heading3"/>
@@ -14297,8 +16553,8 @@
         </w:tc>
       </w:tr>
     </w:tbl>
-    <w:bookmarkEnd w:id="115"/>
-    <w:bookmarkStart w:id="116" w:name="pre-deployment-validation"/>
+    <w:bookmarkEnd w:id="116"/>
+    <w:bookmarkStart w:id="117" w:name="pre-deployment-validation"/>
     <w:p>
       <w:pPr>
         <w:pStyle w:val="Heading3"/>
@@ -14455,7 +16711,25 @@
         <w:pStyle w:val="Compact"/>
       </w:pPr>
       <w:r>
-        <w:t xml:space="preserve">☐ HC rejection reasons logged to OperationRecord for audit</w:t>
+        <w:t xml:space="preserve">☐</w:t>
+      </w:r>
+      <w:r>
+        <w:t xml:space="preserve"> </w:t>
+      </w:r>
+      <w:r>
+        <w:rPr>
+          <w:iCs/>
+          <w:i/>
+          <w:bCs/>
+          <w:b/>
+        </w:rPr>
+        <w:t xml:space="preserve">(v3.0)</w:t>
+      </w:r>
+      <w:r>
+        <w:t xml:space="preserve"> </w:t>
+      </w:r>
+      <w:r>
+        <w:t xml:space="preserve">Two-scope evaluation implemented: CRV-scope gates (HC-8/9/1/4/5/10) resolved once per customer × geography; DPB-scope gates (HC-2/3/6/7/11) per domain × environment × region (PLC-013/014)</w:t>
       </w:r>
     </w:p>
     <w:p>
@@ -14467,7 +16741,244 @@
         <w:pStyle w:val="Compact"/>
       </w:pPr>
       <w:r>
-        <w:t xml:space="preserve">☐ Validation Rules VR-1..VR-11 traced to HC enforcement points</w:t>
+        <w:t xml:space="preserve">☐</w:t>
+      </w:r>
+      <w:r>
+        <w:t xml:space="preserve"> </w:t>
+      </w:r>
+      <w:r>
+        <w:rPr>
+          <w:iCs/>
+          <w:i/>
+          <w:bCs/>
+          <w:b/>
+        </w:rPr>
+        <w:t xml:space="preserve">(v3.0)</w:t>
+      </w:r>
+      <w:r>
+        <w:t xml:space="preserve"> </w:t>
+      </w:r>
+      <w:r>
+        <w:t xml:space="preserve">PLC-015 ordering enforced — CRV strictly precedes DPB; domain groups never re-run region selection (VR-14)</w:t>
+      </w:r>
+    </w:p>
+    <w:p>
+      <w:pPr>
+        <w:numPr>
+          <w:ilvl w:val="0"/>
+          <w:numId w:val="1018"/>
+        </w:numPr>
+        <w:pStyle w:val="Compact"/>
+      </w:pPr>
+      <w:r>
+        <w:t xml:space="preserve">☐</w:t>
+      </w:r>
+      <w:r>
+        <w:t xml:space="preserve"> </w:t>
+      </w:r>
+      <w:r>
+        <w:rPr>
+          <w:iCs/>
+          <w:i/>
+          <w:bCs/>
+          <w:b/>
+        </w:rPr>
+        <w:t xml:space="preserve">(v3.0)</w:t>
+      </w:r>
+      <w:r>
+        <w:t xml:space="preserve"> </w:t>
+      </w:r>
+      <w:r>
+        <w:t xml:space="preserve">Per-domain CRG-set separation validated (CAP-025:</w:t>
+      </w:r>
+      <w:r>
+        <w:t xml:space="preserve"> </w:t>
+      </w:r>
+      <w:r>
+        <w:rPr>
+          <w:rStyle w:val="VerbatimChar"/>
+        </w:rPr>
+        <w:t xml:space="preserve">crg-pr-*</w:t>
+      </w:r>
+      <w:r>
+        <w:t xml:space="preserve"> </w:t>
+      </w:r>
+      <w:r>
+        <w:t xml:space="preserve">/</w:t>
+      </w:r>
+      <w:r>
+        <w:t xml:space="preserve"> </w:t>
+      </w:r>
+      <w:r>
+        <w:rPr>
+          <w:rStyle w:val="VerbatimChar"/>
+        </w:rPr>
+        <w:t xml:space="preserve">crg-cvdr-*</w:t>
+      </w:r>
+      <w:r>
+        <w:t xml:space="preserve"> </w:t>
+      </w:r>
+      <w:r>
+        <w:t xml:space="preserve">/</w:t>
+      </w:r>
+      <w:r>
+        <w:t xml:space="preserve"> </w:t>
+      </w:r>
+      <w:r>
+        <w:rPr>
+          <w:rStyle w:val="VerbatimChar"/>
+        </w:rPr>
+        <w:t xml:space="preserve">crg-drf-*</w:t>
+      </w:r>
+      <w:r>
+        <w:t xml:space="preserve"> </w:t>
+      </w:r>
+      <w:r>
+        <w:t xml:space="preserve">never mixed; DR Foundation not shared with CVAL before approved DR declaration) (VR-13)</w:t>
+      </w:r>
+    </w:p>
+    <w:p>
+      <w:pPr>
+        <w:numPr>
+          <w:ilvl w:val="0"/>
+          <w:numId w:val="1018"/>
+        </w:numPr>
+        <w:pStyle w:val="Compact"/>
+      </w:pPr>
+      <w:r>
+        <w:t xml:space="preserve">☐</w:t>
+      </w:r>
+      <w:r>
+        <w:t xml:space="preserve"> </w:t>
+      </w:r>
+      <w:r>
+        <w:rPr>
+          <w:iCs/>
+          <w:i/>
+          <w:bCs/>
+          <w:b/>
+        </w:rPr>
+        <w:t xml:space="preserve">(v3.0)</w:t>
+      </w:r>
+      <w:r>
+        <w:t xml:space="preserve"> </w:t>
+      </w:r>
+      <w:r>
+        <w:t xml:space="preserve">Domain-bounded sharing validated (DOM-004) — cross-domain CVAL/DR sharing attempts rejected (VR-12)</w:t>
+      </w:r>
+    </w:p>
+    <w:p>
+      <w:pPr>
+        <w:numPr>
+          <w:ilvl w:val="0"/>
+          <w:numId w:val="1018"/>
+        </w:numPr>
+        <w:pStyle w:val="Compact"/>
+      </w:pPr>
+      <w:r>
+        <w:t xml:space="preserve">☐</w:t>
+      </w:r>
+      <w:r>
+        <w:t xml:space="preserve"> </w:t>
+      </w:r>
+      <w:r>
+        <w:rPr>
+          <w:iCs/>
+          <w:i/>
+          <w:bCs/>
+          <w:b/>
+        </w:rPr>
+        <w:t xml:space="preserve">(v3.0)</w:t>
+      </w:r>
+      <w:r>
+        <w:t xml:space="preserve"> </w:t>
+      </w:r>
+      <w:r>
+        <w:t xml:space="preserve">Central quota group across domain ig subscriptions (QUA-015) wired into HC-3/HC-7 evaluation; 85% group/subscription replenishment thresholds</w:t>
+      </w:r>
+    </w:p>
+    <w:p>
+      <w:pPr>
+        <w:numPr>
+          <w:ilvl w:val="0"/>
+          <w:numId w:val="1018"/>
+        </w:numPr>
+        <w:pStyle w:val="Compact"/>
+      </w:pPr>
+      <w:r>
+        <w:t xml:space="preserve">☐</w:t>
+      </w:r>
+      <w:r>
+        <w:t xml:space="preserve"> </w:t>
+      </w:r>
+      <w:r>
+        <w:rPr>
+          <w:iCs/>
+          <w:i/>
+          <w:bCs/>
+          <w:b/>
+        </w:rPr>
+        <w:t xml:space="preserve">(v3.0)</w:t>
+      </w:r>
+      <w:r>
+        <w:t xml:space="preserve"> </w:t>
+      </w:r>
+      <w:r>
+        <w:t xml:space="preserve">DR Foundation floor coverage (DR-021) verified: HC-6/HC-7 account both DR layers per domain without double-counting the shared CVAL/DR set</w:t>
+      </w:r>
+    </w:p>
+    <w:p>
+      <w:pPr>
+        <w:numPr>
+          <w:ilvl w:val="0"/>
+          <w:numId w:val="1018"/>
+        </w:numPr>
+        <w:pStyle w:val="Compact"/>
+      </w:pPr>
+      <w:r>
+        <w:t xml:space="preserve">☐</w:t>
+      </w:r>
+      <w:r>
+        <w:t xml:space="preserve"> </w:t>
+      </w:r>
+      <w:r>
+        <w:rPr>
+          <w:iCs/>
+          <w:i/>
+          <w:bCs/>
+          <w:b/>
+        </w:rPr>
+        <w:t xml:space="preserve">(v3.0)</w:t>
+      </w:r>
+      <w:r>
+        <w:t xml:space="preserve"> </w:t>
+      </w:r>
+      <w:r>
+        <w:t xml:space="preserve">POC-012 (domain-scoped CRG sharing) and POC-013 (two-scope flow on live multi-domain customer) executed</w:t>
+      </w:r>
+    </w:p>
+    <w:p>
+      <w:pPr>
+        <w:numPr>
+          <w:ilvl w:val="0"/>
+          <w:numId w:val="1018"/>
+        </w:numPr>
+        <w:pStyle w:val="Compact"/>
+      </w:pPr>
+      <w:r>
+        <w:t xml:space="preserve">☐ HC rejection reasons logged to OperationRecord for audit</w:t>
+      </w:r>
+    </w:p>
+    <w:p>
+      <w:pPr>
+        <w:numPr>
+          <w:ilvl w:val="0"/>
+          <w:numId w:val="1018"/>
+        </w:numPr>
+        <w:pStyle w:val="Compact"/>
+      </w:pPr>
+      <w:r>
+        <w:t xml:space="preserve">☐ Validation Rules VR-1..VR-14 traced to HC enforcement points</w:t>
       </w:r>
     </w:p>
     <w:p>
@@ -14477,9 +16988,9 @@
         </w:pict>
       </w:r>
     </w:p>
-    <w:bookmarkEnd w:id="116"/>
     <w:bookmarkEnd w:id="117"/>
-    <w:bookmarkStart w:id="118" w:name="appendix-a-decision-log-cross-reference"/>
+    <w:bookmarkEnd w:id="118"/>
+    <w:bookmarkStart w:id="119" w:name="appendix-a-decision-log-cross-reference"/>
     <w:p>
       <w:pPr>
         <w:pStyle w:val="Heading2"/>
@@ -14681,6 +17192,101 @@
           </w:p>
         </w:tc>
       </w:tr>
+      <w:tr>
+        <w:tc>
+          <w:tcPr/>
+          <w:p>
+            <w:pPr>
+              <w:pStyle w:val="Compact"/>
+              <w:jc w:val="left"/>
+            </w:pPr>
+            <w:r>
+              <w:rPr>
+                <w:bCs/>
+                <w:b/>
+              </w:rPr>
+              <w:t xml:space="preserve">DEC-004</w:t>
+            </w:r>
+            <w:r>
+              <w:t xml:space="preserve"> </w:t>
+            </w:r>
+            <w:r>
+              <w:rPr>
+                <w:iCs/>
+                <w:i/>
+              </w:rPr>
+              <w:t xml:space="preserve">(v3.0)</w:t>
+            </w:r>
+          </w:p>
+        </w:tc>
+        <w:tc>
+          <w:tcPr/>
+          <w:p>
+            <w:pPr>
+              <w:pStyle w:val="Compact"/>
+              <w:jc w:val="left"/>
+            </w:pPr>
+            <w:r>
+              <w:t xml:space="preserve">None (scoping only)</w:t>
+            </w:r>
+          </w:p>
+        </w:tc>
+        <w:tc>
+          <w:tcPr/>
+          <w:p>
+            <w:pPr>
+              <w:pStyle w:val="Compact"/>
+              <w:jc w:val="left"/>
+            </w:pPr>
+            <w:r>
+              <w:t xml:space="preserve">Domain-group taxonomy —</w:t>
+            </w:r>
+            <w:r>
+              <w:t xml:space="preserve"> </w:t>
+            </w:r>
+            <w:r>
+              <w:rPr>
+                <w:rStyle w:val="VerbatimChar"/>
+              </w:rPr>
+              <w:t xml:space="preserve">wl-*</w:t>
+            </w:r>
+            <w:r>
+              <w:t xml:space="preserve"> </w:t>
+            </w:r>
+            <w:r>
+              <w:t xml:space="preserve">workload-domain tokens per domain group (DOM-001), optional function-group</w:t>
+            </w:r>
+            <w:r>
+              <w:t xml:space="preserve"> </w:t>
+            </w:r>
+            <w:r>
+              <w:rPr>
+                <w:rStyle w:val="VerbatimChar"/>
+              </w:rPr>
+              <w:t xml:space="preserve">&lt;fn&gt;</w:t>
+            </w:r>
+            <w:r>
+              <w:t xml:space="preserve"> </w:t>
+            </w:r>
+            <w:r>
+              <w:t xml:space="preserve">refinement; configurable via</w:t>
+            </w:r>
+            <w:r>
+              <w:t xml:space="preserve"> </w:t>
+            </w:r>
+            <w:r>
+              <w:rPr>
+                <w:bCs/>
+                <w:b/>
+              </w:rPr>
+              <w:t xml:space="preserve">C-14</w:t>
+            </w:r>
+            <w:r>
+              <w:t xml:space="preserve">. No hard-constraint arithmetic change (HC-1..HC-11 intact); drives CRV/DPB scoping and per-domain CRG naming (CAP-025, C-12)</w:t>
+            </w:r>
+          </w:p>
+        </w:tc>
+      </w:tr>
     </w:tbl>
     <w:p>
       <w:r>
@@ -14689,8 +17295,8 @@
         </w:pict>
       </w:r>
     </w:p>
-    <w:bookmarkEnd w:id="118"/>
-    <w:bookmarkStart w:id="119" w:name="appendix-b-evidence-tags"/>
+    <w:bookmarkEnd w:id="119"/>
+    <w:bookmarkStart w:id="120" w:name="appendix-b-evidence-tags"/>
     <w:p>
       <w:pPr>
         <w:pStyle w:val="Heading2"/>
@@ -14833,11 +17439,11 @@
         <w:t xml:space="preserve"> </w:t>
       </w:r>
       <w:r>
-        <w:t xml:space="preserve">After POC-30 and POC-31 completion (Quota Groups GA validation)</w:t>
-      </w:r>
-    </w:p>
-    <w:bookmarkEnd w:id="119"/>
+        <w:t xml:space="preserve">After POC-30 and POC-31 completion (Quota Groups GA validation) and POC-12/POC-13 (v3.0 two-scope + domain-scoped sharing validation)</w:t>
+      </w:r>
+    </w:p>
     <w:bookmarkEnd w:id="120"/>
+    <w:bookmarkEnd w:id="121"/>
     <w:sectPr/>
   </w:body>
 </w:document>

</xml_diff>